<commit_message>
Creacion de preguntas del entrenamiento en formato DOMJUDGE
</commit_message>
<xml_diff>
--- a/problems/Entrenamiento UPC/B.docx
+++ b/problems/Entrenamiento UPC/B.docx
@@ -275,23 +275,7 @@
           <w:sz w:val="20"/>
           <w:szCs w:val="20"/>
         </w:rPr>
-        <w:t>.</w:t>
-      </w:r>
-      <w:r>
-        <w:rPr>
-          <w:rFonts w:ascii="Times New Roman" w:hAnsi="Times New Roman" w:cs="Times New Roman"/>
-          <w:sz w:val="20"/>
-          <w:szCs w:val="20"/>
-        </w:rPr>
-        <w:t xml:space="preserve"> </w:t>
-      </w:r>
-      <w:r>
-        <w:rPr>
-          <w:rFonts w:ascii="Times New Roman" w:hAnsi="Times New Roman" w:cs="Times New Roman"/>
-          <w:sz w:val="20"/>
-          <w:szCs w:val="20"/>
-        </w:rPr>
-        <w:t xml:space="preserve">Puedes elegir </w:t>
+        <w:t xml:space="preserve">. Puedes elegir </w:t>
       </w:r>
       <w:r>
         <w:rPr>
@@ -411,28 +395,238 @@
       </w:r>
       <w:r>
         <w:rPr>
-          <w:rStyle w:val="Textoennegrita"/>
-          <w:rFonts w:ascii="Times New Roman" w:hAnsi="Times New Roman" w:cs="Times New Roman"/>
-          <w:sz w:val="20"/>
-          <w:szCs w:val="20"/>
-        </w:rPr>
-        <w:t>permutaciones distintas</w:t>
-      </w:r>
-      <w:r>
-        <w:rPr>
-          <w:rFonts w:ascii="Times New Roman" w:hAnsi="Times New Roman" w:cs="Times New Roman"/>
-          <w:sz w:val="20"/>
-          <w:szCs w:val="20"/>
-        </w:rPr>
-        <w:t>*</w:t>
-      </w:r>
-      <w:r>
-        <w:rPr>
-          <w:rFonts w:ascii="Times New Roman" w:hAnsi="Times New Roman" w:cs="Times New Roman"/>
-          <w:sz w:val="20"/>
-          <w:szCs w:val="20"/>
-        </w:rPr>
-        <w:t xml:space="preserve"> de </w:t>
+          <w:rFonts w:ascii="Times New Roman" w:hAnsi="Times New Roman" w:cs="Times New Roman"/>
+          <w:b/>
+          <w:bCs/>
+          <w:sz w:val="20"/>
+          <w:szCs w:val="20"/>
+        </w:rPr>
+        <w:t xml:space="preserve">permutaciones distintas* </w:t>
+      </w:r>
+      <w:r>
+        <w:rPr>
+          <w:rFonts w:ascii="Times New Roman" w:hAnsi="Times New Roman" w:cs="Times New Roman"/>
+          <w:sz w:val="20"/>
+          <w:szCs w:val="20"/>
+        </w:rPr>
+        <w:t xml:space="preserve">de s. Imprime la cadena lexicográficamente menor que tenga la menor cantidad posible de permutaciones distintas después de realizar </w:t>
+      </w:r>
+      <w:r>
+        <w:rPr>
+          <w:rFonts w:ascii="Times New Roman" w:hAnsi="Times New Roman" w:cs="Times New Roman"/>
+          <w:b/>
+          <w:bCs/>
+          <w:sz w:val="20"/>
+          <w:szCs w:val="20"/>
+        </w:rPr>
+        <w:t>exactamente una</w:t>
+      </w:r>
+      <w:r>
+        <w:rPr>
+          <w:rFonts w:ascii="Times New Roman" w:hAnsi="Times New Roman" w:cs="Times New Roman"/>
+          <w:sz w:val="20"/>
+          <w:szCs w:val="20"/>
+        </w:rPr>
+        <w:t xml:space="preserve"> operación.</w:t>
+      </w:r>
+    </w:p>
+    <w:p>
+      <w:pPr>
+        <w:pStyle w:val="Sinespaciado"/>
+        <w:rPr>
+          <w:rFonts w:ascii="Times New Roman" w:hAnsi="Times New Roman" w:cs="Times New Roman"/>
+          <w:sz w:val="20"/>
+          <w:szCs w:val="20"/>
+        </w:rPr>
+      </w:pPr>
+    </w:p>
+    <w:p>
+      <w:pPr>
+        <w:pStyle w:val="Sinespaciado"/>
+        <w:rPr>
+          <w:rFonts w:ascii="Times New Roman" w:hAnsi="Times New Roman" w:cs="Times New Roman"/>
+          <w:sz w:val="20"/>
+          <w:szCs w:val="20"/>
+        </w:rPr>
+      </w:pPr>
+      <w:r>
+        <w:rPr>
+          <w:rFonts w:ascii="Times New Roman" w:hAnsi="Times New Roman" w:cs="Times New Roman"/>
+          <w:sz w:val="20"/>
+          <w:szCs w:val="20"/>
+        </w:rPr>
+        <w:t xml:space="preserve">* Una permutación de una cadena es una disposición de sus caracteres en cualquier orden. Por ejemplo, </w:t>
+      </w:r>
+      <w:r>
+        <w:rPr>
+          <w:rStyle w:val="CdigoHTML"/>
+          <w:rFonts w:ascii="Times New Roman" w:eastAsiaTheme="minorHAnsi" w:hAnsi="Times New Roman" w:cs="Times New Roman"/>
+        </w:rPr>
+        <w:t>"</w:t>
+      </w:r>
+      <w:proofErr w:type="spellStart"/>
+      <w:r>
+        <w:rPr>
+          <w:rStyle w:val="CdigoHTML"/>
+          <w:rFonts w:ascii="Consolas" w:eastAsiaTheme="minorHAnsi" w:hAnsi="Consolas" w:cs="Times New Roman"/>
+        </w:rPr>
+        <w:t>bac</w:t>
+      </w:r>
+      <w:proofErr w:type="spellEnd"/>
+      <w:r>
+        <w:rPr>
+          <w:rStyle w:val="CdigoHTML"/>
+          <w:rFonts w:ascii="Times New Roman" w:eastAsiaTheme="minorHAnsi" w:hAnsi="Times New Roman" w:cs="Times New Roman"/>
+        </w:rPr>
+        <w:t>"</w:t>
+      </w:r>
+      <w:r>
+        <w:rPr>
+          <w:rFonts w:ascii="Times New Roman" w:hAnsi="Times New Roman" w:cs="Times New Roman"/>
+          <w:sz w:val="20"/>
+          <w:szCs w:val="20"/>
+        </w:rPr>
+        <w:t xml:space="preserve"> es una permutación de </w:t>
+      </w:r>
+      <w:r>
+        <w:rPr>
+          <w:rStyle w:val="CdigoHTML"/>
+          <w:rFonts w:ascii="Times New Roman" w:eastAsiaTheme="minorHAnsi" w:hAnsi="Times New Roman" w:cs="Times New Roman"/>
+        </w:rPr>
+        <w:t>"</w:t>
+      </w:r>
+      <w:proofErr w:type="spellStart"/>
+      <w:r>
+        <w:rPr>
+          <w:rStyle w:val="CdigoHTML"/>
+          <w:rFonts w:ascii="Consolas" w:eastAsiaTheme="minorHAnsi" w:hAnsi="Consolas" w:cs="Times New Roman"/>
+        </w:rPr>
+        <w:t>abc</w:t>
+      </w:r>
+      <w:proofErr w:type="spellEnd"/>
+      <w:r>
+        <w:rPr>
+          <w:rStyle w:val="CdigoHTML"/>
+          <w:rFonts w:ascii="Times New Roman" w:eastAsiaTheme="minorHAnsi" w:hAnsi="Times New Roman" w:cs="Times New Roman"/>
+        </w:rPr>
+        <w:t>"</w:t>
+      </w:r>
+      <w:r>
+        <w:rPr>
+          <w:rFonts w:ascii="Times New Roman" w:hAnsi="Times New Roman" w:cs="Times New Roman"/>
+          <w:sz w:val="20"/>
+          <w:szCs w:val="20"/>
+        </w:rPr>
+        <w:t xml:space="preserve">, pero </w:t>
+      </w:r>
+      <w:r>
+        <w:rPr>
+          <w:rStyle w:val="CdigoHTML"/>
+          <w:rFonts w:ascii="Times New Roman" w:eastAsiaTheme="minorHAnsi" w:hAnsi="Times New Roman" w:cs="Times New Roman"/>
+        </w:rPr>
+        <w:t>"</w:t>
+      </w:r>
+      <w:proofErr w:type="spellStart"/>
+      <w:r>
+        <w:rPr>
+          <w:rStyle w:val="CdigoHTML"/>
+          <w:rFonts w:ascii="Consolas" w:eastAsiaTheme="minorHAnsi" w:hAnsi="Consolas" w:cs="Times New Roman"/>
+        </w:rPr>
+        <w:t>bcc</w:t>
+      </w:r>
+      <w:proofErr w:type="spellEnd"/>
+      <w:r>
+        <w:rPr>
+          <w:rStyle w:val="CdigoHTML"/>
+          <w:rFonts w:ascii="Times New Roman" w:eastAsiaTheme="minorHAnsi" w:hAnsi="Times New Roman" w:cs="Times New Roman"/>
+        </w:rPr>
+        <w:t>"</w:t>
+      </w:r>
+      <w:r>
+        <w:rPr>
+          <w:rFonts w:ascii="Times New Roman" w:hAnsi="Times New Roman" w:cs="Times New Roman"/>
+          <w:sz w:val="20"/>
+          <w:szCs w:val="20"/>
+        </w:rPr>
+        <w:t xml:space="preserve"> no lo es.</w:t>
+      </w:r>
+    </w:p>
+    <w:p>
+      <w:pPr>
+        <w:pStyle w:val="Sinespaciado"/>
+        <w:rPr>
+          <w:rFonts w:ascii="Times New Roman" w:hAnsi="Times New Roman" w:cs="Times New Roman"/>
+          <w:sz w:val="20"/>
+          <w:szCs w:val="20"/>
+        </w:rPr>
+      </w:pPr>
+    </w:p>
+    <w:p>
+      <w:pPr>
+        <w:pStyle w:val="Sinespaciado"/>
+        <w:rPr>
+          <w:rFonts w:ascii="Times New Roman" w:hAnsi="Times New Roman" w:cs="Times New Roman"/>
+          <w:b/>
+          <w:bCs/>
+          <w:sz w:val="20"/>
+          <w:szCs w:val="20"/>
+        </w:rPr>
+      </w:pPr>
+      <w:r>
+        <w:rPr>
+          <w:rFonts w:ascii="Times New Roman" w:hAnsi="Times New Roman" w:cs="Times New Roman"/>
+          <w:b/>
+          <w:bCs/>
+          <w:sz w:val="20"/>
+          <w:szCs w:val="20"/>
+        </w:rPr>
+        <w:t>Entrada</w:t>
+      </w:r>
+    </w:p>
+    <w:p>
+      <w:pPr>
+        <w:pStyle w:val="Sinespaciado"/>
+        <w:rPr>
+          <w:rFonts w:ascii="Times New Roman" w:hAnsi="Times New Roman" w:cs="Times New Roman"/>
+          <w:sz w:val="20"/>
+          <w:szCs w:val="20"/>
+        </w:rPr>
+      </w:pPr>
+      <w:r>
+        <w:rPr>
+          <w:rFonts w:ascii="Times New Roman" w:hAnsi="Times New Roman" w:cs="Times New Roman"/>
+          <w:sz w:val="20"/>
+          <w:szCs w:val="20"/>
+        </w:rPr>
+        <w:t>Cada prueba contiene varios casos de prueba.</w:t>
+      </w:r>
+      <w:r>
+        <w:rPr>
+          <w:rFonts w:ascii="Times New Roman" w:hAnsi="Times New Roman" w:cs="Times New Roman"/>
+          <w:sz w:val="20"/>
+          <w:szCs w:val="20"/>
+        </w:rPr>
+        <w:t xml:space="preserve"> </w:t>
+      </w:r>
+    </w:p>
+    <w:p>
+      <w:pPr>
+        <w:pStyle w:val="Sinespaciado"/>
+        <w:rPr>
+          <w:rFonts w:ascii="Times New Roman" w:hAnsi="Times New Roman" w:cs="Times New Roman"/>
+          <w:b/>
+          <w:bCs/>
+          <w:sz w:val="20"/>
+          <w:szCs w:val="20"/>
+        </w:rPr>
+      </w:pPr>
+      <w:r>
+        <w:rPr>
+          <w:rFonts w:ascii="Times New Roman" w:hAnsi="Times New Roman" w:cs="Times New Roman"/>
+          <w:sz w:val="20"/>
+          <w:szCs w:val="20"/>
+        </w:rPr>
+        <w:t xml:space="preserve">La primera línea contiene el número de casos de prueba </w:t>
       </w:r>
       <w:r>
         <w:rPr>
@@ -441,31 +635,7 @@
           <w:b/>
           <w:bCs/>
         </w:rPr>
-        <w:t>s</w:t>
-      </w:r>
-      <w:r>
-        <w:rPr>
-          <w:rFonts w:ascii="Times New Roman" w:hAnsi="Times New Roman" w:cs="Times New Roman"/>
-          <w:sz w:val="20"/>
-          <w:szCs w:val="20"/>
-        </w:rPr>
-        <w:t>.</w:t>
-      </w:r>
-      <w:r>
-        <w:rPr>
-          <w:rFonts w:ascii="Times New Roman" w:hAnsi="Times New Roman" w:cs="Times New Roman"/>
-          <w:sz w:val="20"/>
-          <w:szCs w:val="20"/>
-        </w:rPr>
-        <w:t xml:space="preserve"> </w:t>
-      </w:r>
-      <w:r>
-        <w:rPr>
-          <w:rFonts w:ascii="Times New Roman" w:hAnsi="Times New Roman" w:cs="Times New Roman"/>
-          <w:sz w:val="20"/>
-          <w:szCs w:val="20"/>
-        </w:rPr>
-        <w:t xml:space="preserve">Imprime cualquier cadena que tenga la menor cantidad posible de permutaciones distintas después de realizar </w:t>
+        <w:t>t</w:t>
       </w:r>
       <w:r>
         <w:rPr>
@@ -475,222 +645,7 @@
           <w:sz w:val="20"/>
           <w:szCs w:val="20"/>
         </w:rPr>
-        <w:t xml:space="preserve">exactamente una </w:t>
-      </w:r>
-      <w:r>
-        <w:rPr>
-          <w:rFonts w:ascii="Times New Roman" w:hAnsi="Times New Roman" w:cs="Times New Roman"/>
-          <w:sz w:val="20"/>
-          <w:szCs w:val="20"/>
-        </w:rPr>
-        <w:t>operación.</w:t>
-      </w:r>
-    </w:p>
-    <w:p>
-      <w:pPr>
-        <w:pStyle w:val="Sinespaciado"/>
-        <w:rPr>
-          <w:rFonts w:ascii="Times New Roman" w:hAnsi="Times New Roman" w:cs="Times New Roman"/>
-          <w:sz w:val="20"/>
-          <w:szCs w:val="20"/>
-        </w:rPr>
-      </w:pPr>
-    </w:p>
-    <w:p>
-      <w:pPr>
-        <w:pStyle w:val="Sinespaciado"/>
-        <w:rPr>
-          <w:rFonts w:ascii="Times New Roman" w:hAnsi="Times New Roman" w:cs="Times New Roman"/>
-          <w:sz w:val="20"/>
-          <w:szCs w:val="20"/>
-        </w:rPr>
-      </w:pPr>
-      <w:r>
-        <w:rPr>
-          <w:rFonts w:ascii="Times New Roman" w:hAnsi="Times New Roman" w:cs="Times New Roman"/>
-          <w:sz w:val="20"/>
-          <w:szCs w:val="20"/>
-        </w:rPr>
-        <w:t>*</w:t>
-      </w:r>
-      <w:r>
-        <w:rPr>
-          <w:rFonts w:ascii="Times New Roman" w:hAnsi="Times New Roman" w:cs="Times New Roman"/>
-          <w:sz w:val="20"/>
-          <w:szCs w:val="20"/>
-        </w:rPr>
-        <w:t xml:space="preserve"> Una permutación de una cadena es una disposición de sus caracteres en cualquier orden. Por ejemplo, </w:t>
-      </w:r>
-      <w:r>
-        <w:rPr>
-          <w:rStyle w:val="CdigoHTML"/>
-          <w:rFonts w:ascii="Times New Roman" w:eastAsiaTheme="minorHAnsi" w:hAnsi="Times New Roman" w:cs="Times New Roman"/>
-        </w:rPr>
-        <w:t>"</w:t>
-      </w:r>
-      <w:proofErr w:type="spellStart"/>
-      <w:r>
-        <w:rPr>
-          <w:rStyle w:val="CdigoHTML"/>
-          <w:rFonts w:ascii="Consolas" w:eastAsiaTheme="minorHAnsi" w:hAnsi="Consolas" w:cs="Times New Roman"/>
-        </w:rPr>
-        <w:t>bac</w:t>
-      </w:r>
-      <w:proofErr w:type="spellEnd"/>
-      <w:r>
-        <w:rPr>
-          <w:rStyle w:val="CdigoHTML"/>
-          <w:rFonts w:ascii="Times New Roman" w:eastAsiaTheme="minorHAnsi" w:hAnsi="Times New Roman" w:cs="Times New Roman"/>
-        </w:rPr>
-        <w:t>"</w:t>
-      </w:r>
-      <w:r>
-        <w:rPr>
-          <w:rFonts w:ascii="Times New Roman" w:hAnsi="Times New Roman" w:cs="Times New Roman"/>
-          <w:sz w:val="20"/>
-          <w:szCs w:val="20"/>
-        </w:rPr>
-        <w:t xml:space="preserve"> es una permutación de </w:t>
-      </w:r>
-      <w:r>
-        <w:rPr>
-          <w:rStyle w:val="CdigoHTML"/>
-          <w:rFonts w:ascii="Times New Roman" w:eastAsiaTheme="minorHAnsi" w:hAnsi="Times New Roman" w:cs="Times New Roman"/>
-        </w:rPr>
-        <w:t>"</w:t>
-      </w:r>
-      <w:proofErr w:type="spellStart"/>
-      <w:r>
-        <w:rPr>
-          <w:rStyle w:val="CdigoHTML"/>
-          <w:rFonts w:ascii="Consolas" w:eastAsiaTheme="minorHAnsi" w:hAnsi="Consolas" w:cs="Times New Roman"/>
-        </w:rPr>
-        <w:t>abc</w:t>
-      </w:r>
-      <w:proofErr w:type="spellEnd"/>
-      <w:r>
-        <w:rPr>
-          <w:rStyle w:val="CdigoHTML"/>
-          <w:rFonts w:ascii="Times New Roman" w:eastAsiaTheme="minorHAnsi" w:hAnsi="Times New Roman" w:cs="Times New Roman"/>
-        </w:rPr>
-        <w:t>"</w:t>
-      </w:r>
-      <w:r>
-        <w:rPr>
-          <w:rFonts w:ascii="Times New Roman" w:hAnsi="Times New Roman" w:cs="Times New Roman"/>
-          <w:sz w:val="20"/>
-          <w:szCs w:val="20"/>
-        </w:rPr>
-        <w:t xml:space="preserve">, pero </w:t>
-      </w:r>
-      <w:r>
-        <w:rPr>
-          <w:rStyle w:val="CdigoHTML"/>
-          <w:rFonts w:ascii="Times New Roman" w:eastAsiaTheme="minorHAnsi" w:hAnsi="Times New Roman" w:cs="Times New Roman"/>
-        </w:rPr>
-        <w:t>"</w:t>
-      </w:r>
-      <w:proofErr w:type="spellStart"/>
-      <w:r>
-        <w:rPr>
-          <w:rStyle w:val="CdigoHTML"/>
-          <w:rFonts w:ascii="Consolas" w:eastAsiaTheme="minorHAnsi" w:hAnsi="Consolas" w:cs="Times New Roman"/>
-        </w:rPr>
-        <w:t>bcc</w:t>
-      </w:r>
-      <w:proofErr w:type="spellEnd"/>
-      <w:r>
-        <w:rPr>
-          <w:rStyle w:val="CdigoHTML"/>
-          <w:rFonts w:ascii="Times New Roman" w:eastAsiaTheme="minorHAnsi" w:hAnsi="Times New Roman" w:cs="Times New Roman"/>
-        </w:rPr>
-        <w:t>"</w:t>
-      </w:r>
-      <w:r>
-        <w:rPr>
-          <w:rFonts w:ascii="Times New Roman" w:hAnsi="Times New Roman" w:cs="Times New Roman"/>
-          <w:sz w:val="20"/>
-          <w:szCs w:val="20"/>
-        </w:rPr>
-        <w:t xml:space="preserve"> no lo es.</w:t>
-      </w:r>
-    </w:p>
-    <w:p>
-      <w:pPr>
-        <w:pStyle w:val="Sinespaciado"/>
-        <w:rPr>
-          <w:rFonts w:ascii="Times New Roman" w:hAnsi="Times New Roman" w:cs="Times New Roman"/>
-          <w:sz w:val="20"/>
-          <w:szCs w:val="20"/>
-        </w:rPr>
-      </w:pPr>
-    </w:p>
-    <w:p>
-      <w:pPr>
-        <w:pStyle w:val="Sinespaciado"/>
-        <w:rPr>
-          <w:rFonts w:ascii="Times New Roman" w:hAnsi="Times New Roman" w:cs="Times New Roman"/>
-          <w:b/>
-          <w:bCs/>
-          <w:sz w:val="20"/>
-          <w:szCs w:val="20"/>
-        </w:rPr>
-      </w:pPr>
-      <w:r>
-        <w:rPr>
-          <w:rFonts w:ascii="Times New Roman" w:hAnsi="Times New Roman" w:cs="Times New Roman"/>
-          <w:b/>
-          <w:bCs/>
-          <w:sz w:val="20"/>
-          <w:szCs w:val="20"/>
-        </w:rPr>
-        <w:t>Entrada</w:t>
-      </w:r>
-    </w:p>
-    <w:p>
-      <w:pPr>
-        <w:pStyle w:val="Sinespaciado"/>
-        <w:rPr>
-          <w:rFonts w:ascii="Times New Roman" w:hAnsi="Times New Roman" w:cs="Times New Roman"/>
-          <w:sz w:val="20"/>
-          <w:szCs w:val="20"/>
-        </w:rPr>
-      </w:pPr>
-      <w:r>
-        <w:rPr>
-          <w:rFonts w:ascii="Times New Roman" w:hAnsi="Times New Roman" w:cs="Times New Roman"/>
-          <w:sz w:val="20"/>
-          <w:szCs w:val="20"/>
-        </w:rPr>
-        <w:t>Cada prueba contiene varios casos de prueba.</w:t>
-      </w:r>
-      <w:r>
-        <w:rPr>
-          <w:rFonts w:ascii="Times New Roman" w:hAnsi="Times New Roman" w:cs="Times New Roman"/>
-          <w:sz w:val="20"/>
-          <w:szCs w:val="20"/>
-        </w:rPr>
-        <w:t xml:space="preserve"> </w:t>
-      </w:r>
-    </w:p>
-    <w:p>
-      <w:pPr>
-        <w:pStyle w:val="Sinespaciado"/>
-        <w:rPr>
-          <w:rFonts w:ascii="Times New Roman" w:hAnsi="Times New Roman" w:cs="Times New Roman"/>
-          <w:b/>
-          <w:bCs/>
-          <w:sz w:val="20"/>
-          <w:szCs w:val="20"/>
-        </w:rPr>
-      </w:pPr>
-      <w:r>
-        <w:rPr>
-          <w:rFonts w:ascii="Times New Roman" w:hAnsi="Times New Roman" w:cs="Times New Roman"/>
-          <w:sz w:val="20"/>
-          <w:szCs w:val="20"/>
-        </w:rPr>
-        <w:t xml:space="preserve">La primera línea contiene el número de casos de prueba </w:t>
+        <w:t xml:space="preserve"> (</w:t>
       </w:r>
       <w:r>
         <w:rPr>
@@ -699,7 +654,7 @@
           <w:b/>
           <w:bCs/>
         </w:rPr>
-        <w:t>t</w:t>
+        <w:t>1 ≤ t ≤ 500</w:t>
       </w:r>
       <w:r>
         <w:rPr>
@@ -709,7 +664,53 @@
           <w:sz w:val="20"/>
           <w:szCs w:val="20"/>
         </w:rPr>
-        <w:t xml:space="preserve"> (</w:t>
+        <w:t>).</w:t>
+      </w:r>
+      <w:r>
+        <w:rPr>
+          <w:rFonts w:ascii="Times New Roman" w:hAnsi="Times New Roman" w:cs="Times New Roman"/>
+          <w:b/>
+          <w:bCs/>
+          <w:sz w:val="20"/>
+          <w:szCs w:val="20"/>
+        </w:rPr>
+        <w:t xml:space="preserve"> </w:t>
+      </w:r>
+    </w:p>
+    <w:p>
+      <w:pPr>
+        <w:pStyle w:val="Sinespaciado"/>
+        <w:rPr>
+          <w:rFonts w:ascii="Times New Roman" w:hAnsi="Times New Roman" w:cs="Times New Roman"/>
+          <w:sz w:val="20"/>
+          <w:szCs w:val="20"/>
+        </w:rPr>
+      </w:pPr>
+      <w:r>
+        <w:rPr>
+          <w:rFonts w:ascii="Times New Roman" w:hAnsi="Times New Roman" w:cs="Times New Roman"/>
+          <w:sz w:val="20"/>
+          <w:szCs w:val="20"/>
+        </w:rPr>
+        <w:t>La descripción de los casos de prueba sigue a continuación.</w:t>
+      </w:r>
+    </w:p>
+    <w:p>
+      <w:pPr>
+        <w:pStyle w:val="Sinespaciado"/>
+        <w:rPr>
+          <w:rFonts w:ascii="Times New Roman" w:hAnsi="Times New Roman" w:cs="Times New Roman"/>
+          <w:sz w:val="20"/>
+          <w:szCs w:val="20"/>
+        </w:rPr>
+      </w:pPr>
+      <w:r>
+        <w:rPr>
+          <w:rFonts w:ascii="Times New Roman" w:hAnsi="Times New Roman" w:cs="Times New Roman"/>
+          <w:sz w:val="20"/>
+          <w:szCs w:val="20"/>
+        </w:rPr>
+        <w:t xml:space="preserve">La primera línea de cada caso de prueba contiene un entero </w:t>
       </w:r>
       <w:r>
         <w:rPr>
@@ -718,7 +719,7 @@
           <w:b/>
           <w:bCs/>
         </w:rPr>
-        <w:t>1 ≤ t ≤ 500</w:t>
+        <w:t>n</w:t>
       </w:r>
       <w:r>
         <w:rPr>
@@ -728,53 +729,7 @@
           <w:sz w:val="20"/>
           <w:szCs w:val="20"/>
         </w:rPr>
-        <w:t>).</w:t>
-      </w:r>
-      <w:r>
-        <w:rPr>
-          <w:rFonts w:ascii="Times New Roman" w:hAnsi="Times New Roman" w:cs="Times New Roman"/>
-          <w:b/>
-          <w:bCs/>
-          <w:sz w:val="20"/>
-          <w:szCs w:val="20"/>
-        </w:rPr>
-        <w:t xml:space="preserve"> </w:t>
-      </w:r>
-    </w:p>
-    <w:p>
-      <w:pPr>
-        <w:pStyle w:val="Sinespaciado"/>
-        <w:rPr>
-          <w:rFonts w:ascii="Times New Roman" w:hAnsi="Times New Roman" w:cs="Times New Roman"/>
-          <w:sz w:val="20"/>
-          <w:szCs w:val="20"/>
-        </w:rPr>
-      </w:pPr>
-      <w:r>
-        <w:rPr>
-          <w:rFonts w:ascii="Times New Roman" w:hAnsi="Times New Roman" w:cs="Times New Roman"/>
-          <w:sz w:val="20"/>
-          <w:szCs w:val="20"/>
-        </w:rPr>
-        <w:t>La descripción de los casos de prueba sigue a continuación.</w:t>
-      </w:r>
-    </w:p>
-    <w:p>
-      <w:pPr>
-        <w:pStyle w:val="Sinespaciado"/>
-        <w:rPr>
-          <w:rFonts w:ascii="Times New Roman" w:hAnsi="Times New Roman" w:cs="Times New Roman"/>
-          <w:sz w:val="20"/>
-          <w:szCs w:val="20"/>
-        </w:rPr>
-      </w:pPr>
-      <w:r>
-        <w:rPr>
-          <w:rFonts w:ascii="Times New Roman" w:hAnsi="Times New Roman" w:cs="Times New Roman"/>
-          <w:sz w:val="20"/>
-          <w:szCs w:val="20"/>
-        </w:rPr>
-        <w:t xml:space="preserve">La primera línea de cada caso de prueba contiene un entero </w:t>
+        <w:t xml:space="preserve"> (</w:t>
       </w:r>
       <w:r>
         <w:rPr>
@@ -783,7 +738,7 @@
           <w:b/>
           <w:bCs/>
         </w:rPr>
-        <w:t>n</w:t>
+        <w:t>1 ≤ n ≤ 10</w:t>
       </w:r>
       <w:r>
         <w:rPr>
@@ -793,7 +748,15 @@
           <w:sz w:val="20"/>
           <w:szCs w:val="20"/>
         </w:rPr>
-        <w:t xml:space="preserve"> (</w:t>
+        <w:t>)</w:t>
+      </w:r>
+      <w:r>
+        <w:rPr>
+          <w:rFonts w:ascii="Times New Roman" w:hAnsi="Times New Roman" w:cs="Times New Roman"/>
+          <w:sz w:val="20"/>
+          <w:szCs w:val="20"/>
+        </w:rPr>
+        <w:t xml:space="preserve"> — la longitud de la cadena </w:t>
       </w:r>
       <w:r>
         <w:rPr>
@@ -802,25 +765,33 @@
           <w:b/>
           <w:bCs/>
         </w:rPr>
-        <w:t>1 ≤ n ≤ 10</w:t>
-      </w:r>
-      <w:r>
-        <w:rPr>
-          <w:rFonts w:ascii="Times New Roman" w:hAnsi="Times New Roman" w:cs="Times New Roman"/>
-          <w:b/>
-          <w:bCs/>
-          <w:sz w:val="20"/>
-          <w:szCs w:val="20"/>
-        </w:rPr>
-        <w:t>)</w:t>
-      </w:r>
-      <w:r>
-        <w:rPr>
-          <w:rFonts w:ascii="Times New Roman" w:hAnsi="Times New Roman" w:cs="Times New Roman"/>
-          <w:sz w:val="20"/>
-          <w:szCs w:val="20"/>
-        </w:rPr>
-        <w:t xml:space="preserve"> — la longitud de la cadena </w:t>
+        <w:t>s</w:t>
+      </w:r>
+      <w:r>
+        <w:rPr>
+          <w:rFonts w:ascii="Times New Roman" w:hAnsi="Times New Roman" w:cs="Times New Roman"/>
+          <w:sz w:val="20"/>
+          <w:szCs w:val="20"/>
+        </w:rPr>
+        <w:t>.</w:t>
+      </w:r>
+    </w:p>
+    <w:p>
+      <w:pPr>
+        <w:pStyle w:val="Sinespaciado"/>
+        <w:rPr>
+          <w:rFonts w:ascii="Times New Roman" w:hAnsi="Times New Roman" w:cs="Times New Roman"/>
+          <w:sz w:val="20"/>
+          <w:szCs w:val="20"/>
+        </w:rPr>
+      </w:pPr>
+      <w:r>
+        <w:rPr>
+          <w:rFonts w:ascii="Times New Roman" w:hAnsi="Times New Roman" w:cs="Times New Roman"/>
+          <w:sz w:val="20"/>
+          <w:szCs w:val="20"/>
+        </w:rPr>
+        <w:t xml:space="preserve">La segunda línea de cada caso de prueba contiene la cadena </w:t>
       </w:r>
       <w:r>
         <w:rPr>
@@ -837,25 +808,7 @@
           <w:sz w:val="20"/>
           <w:szCs w:val="20"/>
         </w:rPr>
-        <w:t>.</w:t>
-      </w:r>
-    </w:p>
-    <w:p>
-      <w:pPr>
-        <w:pStyle w:val="Sinespaciado"/>
-        <w:rPr>
-          <w:rFonts w:ascii="Times New Roman" w:hAnsi="Times New Roman" w:cs="Times New Roman"/>
-          <w:sz w:val="20"/>
-          <w:szCs w:val="20"/>
-        </w:rPr>
-      </w:pPr>
-      <w:r>
-        <w:rPr>
-          <w:rFonts w:ascii="Times New Roman" w:hAnsi="Times New Roman" w:cs="Times New Roman"/>
-          <w:sz w:val="20"/>
-          <w:szCs w:val="20"/>
-        </w:rPr>
-        <w:t xml:space="preserve">La segunda línea de cada caso de prueba contiene la cadena </w:t>
+        <w:t xml:space="preserve"> de longitud </w:t>
       </w:r>
       <w:r>
         <w:rPr>
@@ -864,32 +817,65 @@
           <w:b/>
           <w:bCs/>
         </w:rPr>
-        <w:t>s</w:t>
-      </w:r>
-      <w:r>
-        <w:rPr>
-          <w:rFonts w:ascii="Times New Roman" w:hAnsi="Times New Roman" w:cs="Times New Roman"/>
-          <w:sz w:val="20"/>
-          <w:szCs w:val="20"/>
-        </w:rPr>
-        <w:t xml:space="preserve"> de longitud </w:t>
-      </w:r>
-      <w:r>
-        <w:rPr>
-          <w:rStyle w:val="CdigoHTML"/>
-          <w:rFonts w:ascii="Times New Roman" w:eastAsiaTheme="minorHAnsi" w:hAnsi="Times New Roman" w:cs="Times New Roman"/>
+        <w:t>n</w:t>
+      </w:r>
+      <w:r>
+        <w:rPr>
+          <w:rFonts w:ascii="Times New Roman" w:hAnsi="Times New Roman" w:cs="Times New Roman"/>
+          <w:sz w:val="20"/>
+          <w:szCs w:val="20"/>
+        </w:rPr>
+        <w:t>.</w:t>
+      </w:r>
+    </w:p>
+    <w:p>
+      <w:pPr>
+        <w:pStyle w:val="Sinespaciado"/>
+        <w:rPr>
+          <w:rFonts w:ascii="Times New Roman" w:hAnsi="Times New Roman" w:cs="Times New Roman"/>
+          <w:sz w:val="20"/>
+          <w:szCs w:val="20"/>
+        </w:rPr>
+      </w:pPr>
+      <w:r>
+        <w:rPr>
+          <w:rFonts w:ascii="Times New Roman" w:hAnsi="Times New Roman" w:cs="Times New Roman"/>
+          <w:sz w:val="20"/>
+          <w:szCs w:val="20"/>
+        </w:rPr>
+        <w:t>La cadena contiene únicamente letras minúsculas del alfabeto inglés.</w:t>
+      </w:r>
+    </w:p>
+    <w:p>
+      <w:pPr>
+        <w:pStyle w:val="Sinespaciado"/>
+        <w:rPr>
+          <w:rFonts w:ascii="Times New Roman" w:hAnsi="Times New Roman" w:cs="Times New Roman"/>
+          <w:sz w:val="20"/>
+          <w:szCs w:val="20"/>
+        </w:rPr>
+      </w:pPr>
+    </w:p>
+    <w:p>
+      <w:pPr>
+        <w:pStyle w:val="Sinespaciado"/>
+        <w:rPr>
+          <w:rFonts w:ascii="Times New Roman" w:hAnsi="Times New Roman" w:cs="Times New Roman"/>
           <w:b/>
           <w:bCs/>
-        </w:rPr>
-        <w:t>n</w:t>
-      </w:r>
-      <w:r>
-        <w:rPr>
-          <w:rFonts w:ascii="Times New Roman" w:hAnsi="Times New Roman" w:cs="Times New Roman"/>
-          <w:sz w:val="20"/>
-          <w:szCs w:val="20"/>
-        </w:rPr>
-        <w:t>.</w:t>
+          <w:sz w:val="20"/>
+          <w:szCs w:val="20"/>
+        </w:rPr>
+      </w:pPr>
+      <w:r>
+        <w:rPr>
+          <w:rFonts w:ascii="Times New Roman" w:hAnsi="Times New Roman" w:cs="Times New Roman"/>
+          <w:b/>
+          <w:bCs/>
+          <w:sz w:val="20"/>
+          <w:szCs w:val="20"/>
+        </w:rPr>
+        <w:t>Salida</w:t>
       </w:r>
     </w:p>
     <w:p>
@@ -907,92 +893,7 @@
           <w:sz w:val="20"/>
           <w:szCs w:val="20"/>
         </w:rPr>
-        <w:t>La cadena contiene únicamente letras minúsculas del alfabeto inglés.</w:t>
-      </w:r>
-    </w:p>
-    <w:p>
-      <w:pPr>
-        <w:pStyle w:val="Sinespaciado"/>
-        <w:rPr>
-          <w:rFonts w:ascii="Times New Roman" w:hAnsi="Times New Roman" w:cs="Times New Roman"/>
-          <w:sz w:val="20"/>
-          <w:szCs w:val="20"/>
-        </w:rPr>
-      </w:pPr>
-    </w:p>
-    <w:p>
-      <w:pPr>
-        <w:pStyle w:val="Sinespaciado"/>
-        <w:rPr>
-          <w:rFonts w:ascii="Times New Roman" w:hAnsi="Times New Roman" w:cs="Times New Roman"/>
-          <w:b/>
-          <w:bCs/>
-          <w:sz w:val="20"/>
-          <w:szCs w:val="20"/>
-        </w:rPr>
-      </w:pPr>
-      <w:r>
-        <w:rPr>
-          <w:rFonts w:ascii="Times New Roman" w:hAnsi="Times New Roman" w:cs="Times New Roman"/>
-          <w:b/>
-          <w:bCs/>
-          <w:sz w:val="20"/>
-          <w:szCs w:val="20"/>
-        </w:rPr>
-        <w:t>Salida</w:t>
-      </w:r>
-    </w:p>
-    <w:p>
-      <w:pPr>
-        <w:pStyle w:val="Sinespaciado"/>
-        <w:rPr>
-          <w:rFonts w:ascii="Times New Roman" w:hAnsi="Times New Roman" w:cs="Times New Roman"/>
-          <w:sz w:val="20"/>
-          <w:szCs w:val="20"/>
-        </w:rPr>
-      </w:pPr>
-      <w:r>
-        <w:rPr>
-          <w:rFonts w:ascii="Times New Roman" w:hAnsi="Times New Roman" w:cs="Times New Roman"/>
-          <w:sz w:val="20"/>
-          <w:szCs w:val="20"/>
-        </w:rPr>
-        <w:t xml:space="preserve">Para cada caso de prueba, imprime la cadena </w:t>
-      </w:r>
-      <w:r>
-        <w:rPr>
-          <w:rStyle w:val="CdigoHTML"/>
-          <w:rFonts w:ascii="Times New Roman" w:eastAsiaTheme="minorHAnsi" w:hAnsi="Times New Roman" w:cs="Times New Roman"/>
-          <w:b/>
-          <w:bCs/>
-        </w:rPr>
-        <w:t>s</w:t>
-      </w:r>
-      <w:r>
-        <w:rPr>
-          <w:rFonts w:ascii="Times New Roman" w:hAnsi="Times New Roman" w:cs="Times New Roman"/>
-          <w:sz w:val="20"/>
-          <w:szCs w:val="20"/>
-        </w:rPr>
-        <w:t xml:space="preserve"> requerida después de aplicar exactamente una operación.</w:t>
-      </w:r>
-    </w:p>
-    <w:p>
-      <w:pPr>
-        <w:pStyle w:val="Sinespaciado"/>
-        <w:rPr>
-          <w:rFonts w:ascii="Times New Roman" w:hAnsi="Times New Roman" w:cs="Times New Roman"/>
-          <w:sz w:val="20"/>
-          <w:szCs w:val="20"/>
-        </w:rPr>
-      </w:pPr>
-      <w:r>
-        <w:rPr>
-          <w:rFonts w:ascii="Times New Roman" w:hAnsi="Times New Roman" w:cs="Times New Roman"/>
-          <w:sz w:val="20"/>
-          <w:szCs w:val="20"/>
-        </w:rPr>
-        <w:t>Si existen múltiples soluciones, imprime cualquiera de ellas.</w:t>
+        <w:t>Para cada caso de prueba, imprime la cadena lexicográficamente menor que resulte de aplicar exactamente una operación y que tenga el mínimo número de permutaciones distintas.</w:t>
       </w:r>
     </w:p>
     <w:p>
@@ -2276,24 +2177,15 @@
         <w:pStyle w:val="Sinespaciado"/>
         <w:rPr>
           <w:rFonts w:ascii="Times New Roman" w:hAnsi="Times New Roman" w:cs="Times New Roman"/>
-          <w:sz w:val="20"/>
-          <w:szCs w:val="20"/>
-        </w:rPr>
-      </w:pPr>
-      <w:r>
-        <w:rPr>
-          <w:rFonts w:ascii="Times New Roman" w:hAnsi="Times New Roman" w:cs="Times New Roman"/>
-          <w:sz w:val="20"/>
-          <w:szCs w:val="20"/>
-        </w:rPr>
-        <w:t xml:space="preserve">De hecho, todas las cadenas obtenibles excepto </w:t>
-      </w:r>
-      <w:r>
-        <w:rPr>
-          <w:rStyle w:val="CdigoHTML"/>
-          <w:rFonts w:ascii="Times New Roman" w:eastAsiaTheme="minorHAnsi" w:hAnsi="Times New Roman" w:cs="Times New Roman"/>
-        </w:rPr>
-        <w:t>"</w:t>
+        </w:rPr>
+      </w:pPr>
+      <w:r>
+        <w:rPr>
+          <w:rFonts w:ascii="Times New Roman" w:hAnsi="Times New Roman" w:cs="Times New Roman"/>
+          <w:sz w:val="20"/>
+          <w:szCs w:val="20"/>
+        </w:rPr>
+        <w:t>De hecho, todas las cadenas obtenibles excepto "</w:t>
       </w:r>
       <w:proofErr w:type="spellStart"/>
       <w:r>
@@ -2306,25 +2198,19 @@
       <w:proofErr w:type="spellEnd"/>
       <w:r>
         <w:rPr>
-          <w:rStyle w:val="CdigoHTML"/>
-          <w:rFonts w:ascii="Times New Roman" w:eastAsiaTheme="minorHAnsi" w:hAnsi="Times New Roman" w:cs="Times New Roman"/>
-        </w:rPr>
-        <w:t>"</w:t>
-      </w:r>
-      <w:r>
-        <w:rPr>
-          <w:rFonts w:ascii="Times New Roman" w:hAnsi="Times New Roman" w:cs="Times New Roman"/>
-          <w:sz w:val="20"/>
-          <w:szCs w:val="20"/>
-        </w:rPr>
-        <w:t xml:space="preserve"> tienen </w:t>
-      </w:r>
-      <w:r>
-        <w:rPr>
-          <w:rStyle w:val="CdigoHTML"/>
-          <w:rFonts w:ascii="Times New Roman" w:eastAsiaTheme="minorHAnsi" w:hAnsi="Times New Roman" w:cs="Times New Roman"/>
+          <w:rFonts w:ascii="Times New Roman" w:hAnsi="Times New Roman" w:cs="Times New Roman"/>
+          <w:sz w:val="20"/>
+          <w:szCs w:val="20"/>
+        </w:rPr>
+        <w:t xml:space="preserve">" tienen </w:t>
+      </w:r>
+      <w:r>
+        <w:rPr>
+          <w:rFonts w:ascii="Times New Roman" w:hAnsi="Times New Roman" w:cs="Times New Roman"/>
           <w:b/>
           <w:bCs/>
+          <w:sz w:val="20"/>
+          <w:szCs w:val="20"/>
         </w:rPr>
         <w:t>3</w:t>
       </w:r>
@@ -2334,34 +2220,25 @@
           <w:sz w:val="20"/>
           <w:szCs w:val="20"/>
         </w:rPr>
-        <w:t xml:space="preserve"> permutaciones, por lo que cualquiera de ellas sería </w:t>
-      </w:r>
-      <w:proofErr w:type="gramStart"/>
-      <w:r>
-        <w:rPr>
-          <w:rFonts w:ascii="Times New Roman" w:hAnsi="Times New Roman" w:cs="Times New Roman"/>
-          <w:sz w:val="20"/>
-          <w:szCs w:val="20"/>
-        </w:rPr>
-        <w:t>aceptada</w:t>
-      </w:r>
-      <w:proofErr w:type="gramEnd"/>
-      <w:r>
-        <w:rPr>
-          <w:rFonts w:ascii="Times New Roman" w:hAnsi="Times New Roman" w:cs="Times New Roman"/>
-          <w:sz w:val="20"/>
-          <w:szCs w:val="20"/>
-        </w:rPr>
-        <w:t>.</w:t>
-      </w:r>
-    </w:p>
-    <w:p>
-      <w:pPr>
-        <w:pStyle w:val="Sinespaciado"/>
-        <w:rPr>
-          <w:rFonts w:ascii="Times New Roman" w:hAnsi="Times New Roman" w:cs="Times New Roman"/>
-        </w:rPr>
-      </w:pPr>
+        <w:t xml:space="preserve"> permutaciones. La lexicográficamente menor de ellas es "</w:t>
+      </w:r>
+      <w:proofErr w:type="spellStart"/>
+      <w:r>
+        <w:rPr>
+          <w:rStyle w:val="CdigoHTML"/>
+          <w:rFonts w:ascii="Consolas" w:eastAsiaTheme="minorHAnsi" w:hAnsi="Consolas" w:cs="Times New Roman"/>
+        </w:rPr>
+        <w:t>aac</w:t>
+      </w:r>
+      <w:proofErr w:type="spellEnd"/>
+      <w:r>
+        <w:rPr>
+          <w:rFonts w:ascii="Times New Roman" w:hAnsi="Times New Roman" w:cs="Times New Roman"/>
+          <w:sz w:val="20"/>
+          <w:szCs w:val="20"/>
+        </w:rPr>
+        <w:t>".</w:t>
+      </w:r>
     </w:p>
     <w:sectPr>
       <w:headerReference w:type="default" r:id="rId7"/>

</xml_diff>